<commit_message>
Add Vingroup Korean bond benchmark to memo and slides
Co-Authored-By: Claude Sonnet 5.5 <noreply@anthropic.com>
Claude-Session: https://claude.ai/code/session_01JkmxWL94b2TGL1qFG2y35j
</commit_message>
<xml_diff>
--- a/output/Memo_Sunshine_vs_Vingroup.docx
+++ b/output/Memo_Sunshine_vs_Vingroup.docx
@@ -547,6 +547,46 @@
         <w:pStyle w:val="Heading2"/>
       </w:pPr>
       <w:r>
+        <w:t>3b. Benchmark: Vingroup's Korean bond (press reports)</w:t>
+      </w:r>
+    </w:p>
+    <w:p>
+      <w:pPr>
+        <w:pStyle w:val="ListBullet"/>
+      </w:pPr>
+      <w:r>
+        <w:t>Reported terms: 3-year, KRW-denominated private placement to Korean institutions at roughly 7% a year; lead underwriters KB Securities, Kiwoom Securities and Shinhan Securities; issue expected around October 2026 (Gate.com, 22 Sep 2026).</w:t>
+      </w:r>
+    </w:p>
+    <w:p>
+      <w:pPr>
+        <w:pStyle w:val="ListBullet"/>
+      </w:pPr>
+      <w:r>
+        <w:t>Reported saving: Vietnamese bank lending rates are in the ~10% range and a domestic Vingroup bond would cost above 11%, so the Korean bond saves roughly 4 percentage points. This is the commercial case for Sunshine.</w:t>
+      </w:r>
+    </w:p>
+    <w:p>
+      <w:pPr>
+        <w:pStyle w:val="ListBullet"/>
+      </w:pPr>
+      <w:r>
+        <w:t>Size is inconsistent across sources: earlier reports say up to KRW 400bn (~US$292m); the Gate.com text says 3,000-4,000bn, which looks 10x too large. Use KRW 300-400bn until the KED article is checked.</w:t>
+      </w:r>
+    </w:p>
+    <w:p>
+      <w:pPr>
+        <w:pStyle w:val="ListBullet"/>
+      </w:pPr>
+      <w:r>
+        <w:t>Security is not stated in the sources found. A weaker credit than Vingroup should expect a coupon above ~7% and/or need the collateral to reach comparable pricing; the model can test how much collateral is needed.</w:t>
+      </w:r>
+    </w:p>
+    <w:p>
+      <w:pPr>
+        <w:pStyle w:val="Heading2"/>
+      </w:pPr>
+      <w:r>
         <w:t>4. Risks a Korean investor will raise</w:t>
       </w:r>
     </w:p>

</xml_diff>

<commit_message>
Refine Vingroup Korean bond benchmark with VIFC Insight details
Co-Authored-By: Claude Sonnet 5.5 <noreply@anthropic.com>
Claude-Session: https://claude.ai/code/session_01JkmxWL94b2TGL1qFG2y35j
</commit_message>
<xml_diff>
--- a/output/Memo_Sunshine_vs_Vingroup.docx
+++ b/output/Memo_Sunshine_vs_Vingroup.docx
@@ -555,7 +555,7 @@
         <w:pStyle w:val="ListBullet"/>
       </w:pPr>
       <w:r>
-        <w:t>Reported terms: 3-year, KRW-denominated private placement to Korean institutions at roughly 7% a year; lead underwriters KB Securities, Kiwoom Securities and Shinhan Securities; issue expected around October 2026 (Gate.com, 22 Sep 2026).</w:t>
+        <w:t>Reported terms: 3-year KRW private placement to Korean institutions (pension funds, insurers, securities firms); Shinhan Securities Vietnam, KB Securities and Kiwoom Securities involved; proceeds for general corporate financing; issue expected around October 2026. Described as the first Vietnamese corporate to tap the Korean bond market (VIFC Insight).</w:t>
       </w:r>
     </w:p>
     <w:p>
@@ -563,7 +563,7 @@
         <w:pStyle w:val="ListBullet"/>
       </w:pPr>
       <w:r>
-        <w:t>Reported saving: Vietnamese bank lending rates are in the ~10% range and a domestic Vingroup bond would cost above 11%, so the Korean bond saves roughly 4 percentage points. This is the commercial case for Sunshine.</w:t>
+        <w:t>Pricing: not disclosed in VIFC Insight. Gate.com reports a ~7% coupon (single source, unconfirmed) versus above 11% for a domestic Vingroup bond, i.e. a saving of roughly 4 points. If confirmed, this is the commercial case for Sunshine.</w:t>
       </w:r>
     </w:p>
     <w:p>
@@ -571,7 +571,7 @@
         <w:pStyle w:val="ListBullet"/>
       </w:pPr>
       <w:r>
-        <w:t>Size is inconsistent across sources: earlier reports say up to KRW 400bn (~US$292m); the Gate.com text says 3,000-4,000bn, which looks 10x too large. Use KRW 300-400bn until the KED article is checked.</w:t>
+        <w:t>Size: board approval up to KRW 455bn (~US$332m); deal under discussion about KRW 400bn (~US$292m) (VIFC Insight, Bloomberg-sourced earlier reports). Gate.com's '3,000-4,000bn' looks like a 10x error and is not used. A separate report mentions a KRW 300bn Arirang bond; treat as unreconciled.</w:t>
       </w:r>
     </w:p>
     <w:p>

</xml_diff>

<commit_message>
Update Vingroup bond benchmark (secured, 8% cap) and set collateral calculator to KRW 400bn
Co-Authored-By: Claude Sonnet 5.5 <noreply@anthropic.com>
Claude-Session: https://claude.ai/code/session_01JkmxWL94b2TGL1qFG2y35j
</commit_message>
<xml_diff>
--- a/output/Memo_Sunshine_vs_Vingroup.docx
+++ b/output/Memo_Sunshine_vs_Vingroup.docx
@@ -555,7 +555,7 @@
         <w:pStyle w:val="ListBullet"/>
       </w:pPr>
       <w:r>
-        <w:t>Reported terms: 3-year KRW private placement to Korean institutions (pension funds, insurers, securities firms); Shinhan Securities Vietnam, KB Securities and Kiwoom Securities involved; proceeds for general corporate financing; issue expected around October 2026. Described as the first Vietnamese corporate to tap the Korean bond market (VIFC Insight).</w:t>
+        <w:t>Reported terms (board resolution 11 Aug 2026; Korean, Vietnamese and English press): 3-year KRW private placement to Korean institutions (pension funds, insurers, securities firms), direct obligation of Vingroup, non-convertible, not listed in Vietnam; Shinhan Securities Vietnam sole arranger with KB and Kiwoom; Shinhan to invest KRW 40bn itself; about KRW 300bn of demand secured; pricing expected mid-October 2026; first Vietnamese corporate Arirang bond.</w:t>
       </w:r>
     </w:p>
     <w:p>
@@ -563,7 +563,7 @@
         <w:pStyle w:val="ListBullet"/>
       </w:pPr>
       <w:r>
-        <w:t>Pricing: not disclosed in VIFC Insight. Gate.com reports a ~7% coupon (single source, unconfirmed) versus above 11% for a domestic Vingroup bond, i.e. a saving of roughly 4 points. If confirmed, this is the commercial case for Sunshine.</w:t>
+        <w:t>Pricing: fixed coupon capped at 8% per year in the resolution; Korean press expects about 7% (not yet issued, so unconfirmed) versus above 11% for a domestic bond and 2+ points below USD funding. If confirmed, a 4-point saving is the commercial case for Sunshine.</w:t>
       </w:r>
     </w:p>
     <w:p>
@@ -571,7 +571,7 @@
         <w:pStyle w:val="ListBullet"/>
       </w:pPr>
       <w:r>
-        <w:t>Size: board approval up to KRW 455bn (~US$332m); deal under discussion about KRW 400bn (~US$292m) (VIFC Insight, Bloomberg-sourced earlier reports). Gate.com's '3,000-4,000bn' looks like a 10x error and is not used. A separate report mentions a KRW 300bn Arirang bond; treat as unreconciled.</w:t>
+        <w:t>Size: board approval up to KRW 455bn; deal about KRW 300-400bn (~US$292m at 400bn). Gate.com's '4,000 billion' is a mistranslation of the Korean '4000억' (= KRW 400bn).</w:t>
       </w:r>
     </w:p>
     <w:p>
@@ -579,7 +579,7 @@
         <w:pStyle w:val="ListBullet"/>
       </w:pPr>
       <w:r>
-        <w:t>Security is not stated in the sources found. A weaker credit than Vingroup should expect a coupon above ~7% and/or need the collateral to reach comparable pricing; the model can test how much collateral is needed.</w:t>
+        <w:t>Security: the board resolution is reported as 'secured' (có bảo đảm) by MarketScreener, Investing.com, Nguoi Quan Sat and StockBiz; one outlet (CafeF) says unsecured. The pledged assets are not disclosed in the sources found. Treat Vingroup as probably secured, which means a land-secured Sunshine bond is in line with the benchmark, not an extra. Confirm against the original resolution on vingroup.net / HOSE.</w:t>
       </w:r>
     </w:p>
     <w:p>
@@ -635,7 +635,7 @@
         <w:pStyle w:val="ListBullet"/>
       </w:pPr>
       <w:r>
-        <w:t>Premise check: Vingroup's board approved using assets as security for some corporate bonds in 2025, so 'Vingroup is unsecured' needs confirming against the Korean deal terms.</w:t>
+        <w:t>Premise correction: the working assumption that Vingroup issued without collateral is probably wrong. Reports of the 11 Aug 2026 board resolution describe the Korean bond as secured; the collateral itself is undisclosed, so the security package cannot yet be compared.</w:t>
       </w:r>
     </w:p>
     <w:p>
@@ -659,7 +659,7 @@
         <w:pStyle w:val="ListBullet"/>
       </w:pPr>
       <w:r>
-        <w:t>Size and test the deal with the Excel LTV calculator: with illustrative inputs (KRW 300bn ~ VND 5.4tn, 30% haircut, 60% target LTV) the land would need an appraised value of about VND 12.9tn. Replace with the real valuation.</w:t>
+        <w:t>Size and test the deal with the Excel LTV calculator: with illustrative inputs (KRW 400bn ~ VND 7.2tn at 18 VND/KRW, 30% haircut, 60% target LTV) the land would need an appraised value of about VND 17.1tn. Replace with the real valuation.</w:t>
       </w:r>
     </w:p>
     <w:p>

</xml_diff>